<commit_message>
feat: add fill_week02_report.py script and updated week 02 report
- Script auto-fills template with student info, chapters 1-2, references
- SHA256-verified output differs from source template
- All placeholders replaced with real content

Co-Authored-By: Claude <noreply@anthropic.com>
</commit_message>
<xml_diff>
--- a/report/LuongNguyenNgocDinh_baocaotieuluanlan01.docx
+++ b/report/LuongNguyenNgocDinh_baocaotieuluanlan01.docx
@@ -2265,7 +2265,7 @@
               <w:jc w:val="left"/>
             </w:pPr>
             <w:r>
-              <w:t>Khoảng 2-3 trang (xem Chương 1)</w:t>
+              <w:t>Khoảng 2–3 trang (xem Chương 1)</w:t>
             </w:r>
             <w:r>
               <w:rPr>
@@ -2386,7 +2386,7 @@
               <w:jc w:val="left"/>
             </w:pPr>
             <w:r>
-              <w:t>Khoảng 2-3 trang bản nháp (xem Chương 2)</w:t>
+              <w:t>Khoảng 2–3 trang bản nháp (xem Chương 2)</w:t>
             </w:r>
             <w:r>
               <w:rPr>
@@ -2628,7 +2628,7 @@
               <w:jc w:val="left"/>
             </w:pPr>
             <w:r>
-              <w:t>https://github.com/dinhvaren/iot-gateway-security-lab | Commit 3ef5207</w:t>
+              <w:t>https://github.com/dinhvaren/iot-gateway-security-lab | Commit 407f53c</w:t>
             </w:r>
             <w:r>
               <w:rPr>
@@ -2749,7 +2749,7 @@
               <w:jc w:val="left"/>
             </w:pPr>
             <w:r>
-              <w:t>Phần C – Dàn ý Chương 3 + docs/KE_HOACH_TUAN_03.md</w:t>
+              <w:t>Phần C – Dàn ý Chương 3 + docs/KIEN_TRUC_HE_THONG.md</w:t>
             </w:r>
             <w:r>
               <w:rPr>
@@ -3879,17 +3879,17 @@
         <w:br/>
         <w:t>IoT Device Simulator --&gt; [HTTP/MQTT] --&gt; Node-RED Security Gateway --&gt; [HTTP] --&gt; Cloud Sink Simulator</w:t>
         <w:br/>
-        <w:t xml:space="preserve">                                                |</w:t>
+        <w:t xml:space="preserve">                                            |</w:t>
         <w:br/>
-        <w:t xml:space="preserve">                                                +-- Authentication (token/API key)</w:t>
+        <w:t xml:space="preserve">                                            +-- Authentication (token/API key)</w:t>
         <w:br/>
-        <w:t xml:space="preserve">                                                +-- Device/Data Validation (schema, required fields)</w:t>
+        <w:t xml:space="preserve">                                            +-- Device/Data Validation (schema, required fields)</w:t>
         <w:br/>
-        <w:t xml:space="preserve">                                                +-- Filtering (threshold, range check)</w:t>
+        <w:t xml:space="preserve">                                            +-- Filtering (threshold, range check)</w:t>
         <w:br/>
-        <w:t xml:space="preserve">                                                +-- Freshness/Replay Check (timestamp, nonce)</w:t>
+        <w:t xml:space="preserve">                                            +-- Freshness/Replay Check (timestamp, nonce)</w:t>
         <w:br/>
-        <w:t xml:space="preserve">                                                +-- Audit Logging (ACCEPT/REJECT + reason)</w:t>
+        <w:t xml:space="preserve">                                            +-- Audit Logging (ACCEPT/REJECT + reason)</w:t>
         <w:br/>
         <w:br/>
         <w:t>Hình 2.1. Kiến trúc dự kiến của mô hình IoT Security Gateway</w:t>
@@ -5739,7 +5739,7 @@
               <w:jc w:val="left"/>
             </w:pPr>
             <w:r>
-              <w:t>Tham khảo năng lực bảo mật cơ bản cho thiết bị IoT, đặc biệt về khả năng ghi nhận trạng thái và sự kiện an ninh. Tài liệu hiện hành tại ngày truy cập.</w:t>
+              <w:t>Tham khảo năng lực bảo mật cơ bản cho thiết bị IoT; tài liệu hiện hành tại ngày truy cập.</w:t>
             </w:r>
             <w:r>
               <w:rPr>
@@ -5891,7 +5891,7 @@
               <w:jc w:val="left"/>
             </w:pPr>
             <w:r>
-              <w:t>Tham khảo nguyên tắc bảo mật cho thiết bị IoT tiêu dùng, bao gồm quản lý credential, bảo vệ dữ liệu và khả năng ghi nhận sự kiện. Tài liệu hiện hành tại ngày truy cập.</w:t>
+              <w:t>Tham khảo nguyên tắc bảo mật cho thiết bị IoT tiêu dùng; tài liệu hiện hành tại ngày truy cập.</w:t>
             </w:r>
             <w:r>
               <w:rPr>
@@ -8176,7 +8176,9 @@
               <w:spacing w:before="0" w:after="0" w:line="276" w:lineRule="auto"/>
               <w:jc w:val="center"/>
             </w:pPr>
-            <w:r/>
+            <w:r>
+              <w:t>MC-01</w:t>
+            </w:r>
             <w:r>
               <w:rPr>
                 <w:rFonts w:ascii="Times New Roman" w:hAnsi="Times New Roman" w:eastAsia="Times New Roman" w:cs="Times New Roman"/>
@@ -8185,7 +8187,6 @@
                 <w:color w:val="1F2937"/>
                 <w:sz w:val="21"/>
               </w:rPr>
-              <w:t>MC-01</w:t>
             </w:r>
           </w:p>
         </w:tc>
@@ -8327,7 +8328,9 @@
               <w:spacing w:before="0" w:after="0" w:line="276" w:lineRule="auto"/>
               <w:jc w:val="center"/>
             </w:pPr>
-            <w:r/>
+            <w:r>
+              <w:t>MC-02</w:t>
+            </w:r>
             <w:r>
               <w:rPr>
                 <w:rFonts w:ascii="Times New Roman" w:hAnsi="Times New Roman" w:eastAsia="Times New Roman" w:cs="Times New Roman"/>
@@ -8336,7 +8339,6 @@
                 <w:color w:val="1F2937"/>
                 <w:sz w:val="21"/>
               </w:rPr>
-              <w:t>MC-02</w:t>
             </w:r>
           </w:p>
         </w:tc>
@@ -8478,7 +8480,9 @@
               <w:spacing w:before="0" w:after="0" w:line="276" w:lineRule="auto"/>
               <w:jc w:val="center"/>
             </w:pPr>
-            <w:r/>
+            <w:r>
+              <w:t>MC-03</w:t>
+            </w:r>
             <w:r>
               <w:rPr>
                 <w:rFonts w:ascii="Times New Roman" w:hAnsi="Times New Roman" w:eastAsia="Times New Roman" w:cs="Times New Roman"/>
@@ -8487,7 +8491,6 @@
                 <w:color w:val="1F2937"/>
                 <w:sz w:val="21"/>
               </w:rPr>
-              <w:t>MC-03</w:t>
             </w:r>
           </w:p>
         </w:tc>
@@ -8629,7 +8632,9 @@
               <w:spacing w:before="0" w:after="0" w:line="276" w:lineRule="auto"/>
               <w:jc w:val="center"/>
             </w:pPr>
-            <w:r/>
+            <w:r>
+              <w:t>MC-04</w:t>
+            </w:r>
             <w:r>
               <w:rPr>
                 <w:rFonts w:ascii="Times New Roman" w:hAnsi="Times New Roman" w:eastAsia="Times New Roman" w:cs="Times New Roman"/>
@@ -8638,7 +8643,6 @@
                 <w:color w:val="1F2937"/>
                 <w:sz w:val="21"/>
               </w:rPr>
-              <w:t>MC-04</w:t>
             </w:r>
           </w:p>
         </w:tc>
@@ -8780,7 +8784,9 @@
               <w:spacing w:before="0" w:after="0" w:line="276" w:lineRule="auto"/>
               <w:jc w:val="center"/>
             </w:pPr>
-            <w:r/>
+            <w:r>
+              <w:t>MC-05</w:t>
+            </w:r>
             <w:r>
               <w:rPr>
                 <w:rFonts w:ascii="Times New Roman" w:hAnsi="Times New Roman" w:eastAsia="Times New Roman" w:cs="Times New Roman"/>
@@ -8789,7 +8795,6 @@
                 <w:color w:val="1F2937"/>
                 <w:sz w:val="21"/>
               </w:rPr>
-              <w:t>MC-05</w:t>
             </w:r>
           </w:p>
         </w:tc>
@@ -8810,7 +8815,7 @@
               <w:jc w:val="left"/>
             </w:pPr>
             <w:r>
-              <w:t>Kế hoạch/kiến trúc dự kiến</w:t>
+              <w:t>Kế hoạch/kiến trúc</w:t>
             </w:r>
             <w:r>
               <w:rPr>

</xml_diff>